<commit_message>
Update radish to 8%
</commit_message>
<xml_diff>
--- a/mergefield_docs_templates/2026_2027_SEMESTR_1/Zalacznik_IV_Wniosek_o_pomoc.docx
+++ b/mergefield_docs_templates/2026_2027_SEMESTR_1/Zalacznik_IV_Wniosek_o_pomoc.docx
@@ -8861,7 +8861,17 @@
                 <w:sz w:val="18"/>
                 <w:szCs w:val="18"/>
               </w:rPr>
-              <w:t>5%</w:t>
+              <w:t>8</w:t>
+            </w:r>
+            <w:r>
+              <w:rPr>
+                <w:rFonts w:ascii="Arial" w:hAnsi="Arial" w:cs="Arial"/>
+                <w:b/>
+                <w:color w:val="339966"/>
+                <w:sz w:val="18"/>
+                <w:szCs w:val="18"/>
+              </w:rPr>
+              <w:t>%</w:t>
             </w:r>
           </w:p>
         </w:tc>
@@ -9453,17 +9463,7 @@
                 <w:sz w:val="18"/>
                 <w:szCs w:val="18"/>
               </w:rPr>
-              <w:t>«</w:t>
-            </w:r>
-            <w:proofErr w:type="spellStart"/>
-            <w:r>
-              <w:rPr>
-                <w:rFonts w:ascii="Arial" w:hAnsi="Arial" w:cs="Arial"/>
-                <w:b/>
-                <w:sz w:val="18"/>
-                <w:szCs w:val="18"/>
-              </w:rPr>
-              <w:t>tomato»</w:t>
+              <w:t>«tomato»</w:t>
             </w:r>
             <w:r>
               <w:rPr>
@@ -9474,7 +9474,6 @@
               </w:rPr>
               <w:fldChar w:fldCharType="end"/>
             </w:r>
-            <w:proofErr w:type="spellEnd"/>
           </w:p>
         </w:tc>
         <w:tc>
@@ -9559,27 +9558,7 @@
                 <w:sz w:val="18"/>
                 <w:szCs w:val="18"/>
               </w:rPr>
-              <w:t>«</w:t>
-            </w:r>
-            <w:proofErr w:type="spellStart"/>
-            <w:r>
-              <w:rPr>
-                <w:rFonts w:ascii="Arial" w:hAnsi="Arial" w:cs="Arial"/>
-                <w:b/>
-                <w:sz w:val="18"/>
-                <w:szCs w:val="18"/>
-              </w:rPr>
-              <w:t>tomatown</w:t>
-            </w:r>
-            <w:proofErr w:type="spellEnd"/>
-            <w:r>
-              <w:rPr>
-                <w:rFonts w:ascii="Arial" w:hAnsi="Arial" w:cs="Arial"/>
-                <w:b/>
-                <w:sz w:val="18"/>
-                <w:szCs w:val="18"/>
-              </w:rPr>
-              <w:t>»</w:t>
+              <w:t>«tomatown»</w:t>
             </w:r>
             <w:r>
               <w:rPr>
@@ -9671,27 +9650,7 @@
                 <w:sz w:val="18"/>
                 <w:szCs w:val="18"/>
               </w:rPr>
-              <w:t>«</w:t>
-            </w:r>
-            <w:proofErr w:type="spellStart"/>
-            <w:r>
-              <w:rPr>
-                <w:rFonts w:ascii="Arial" w:hAnsi="Arial" w:cs="Arial"/>
-                <w:b/>
-                <w:sz w:val="18"/>
-                <w:szCs w:val="18"/>
-              </w:rPr>
-              <w:t>tomatovat</w:t>
-            </w:r>
-            <w:proofErr w:type="spellEnd"/>
-            <w:r>
-              <w:rPr>
-                <w:rFonts w:ascii="Arial" w:hAnsi="Arial" w:cs="Arial"/>
-                <w:b/>
-                <w:sz w:val="18"/>
-                <w:szCs w:val="18"/>
-              </w:rPr>
-              <w:t>»</w:t>
+              <w:t>«tomatovat»</w:t>
             </w:r>
             <w:r>
               <w:rPr>
@@ -9753,27 +9712,7 @@
                 <w:sz w:val="18"/>
                 <w:szCs w:val="18"/>
               </w:rPr>
-              <w:t>«</w:t>
-            </w:r>
-            <w:proofErr w:type="spellStart"/>
-            <w:r>
-              <w:rPr>
-                <w:rFonts w:ascii="Arial" w:hAnsi="Arial" w:cs="Arial"/>
-                <w:b/>
-                <w:sz w:val="18"/>
-                <w:szCs w:val="18"/>
-              </w:rPr>
-              <w:t>tomatowb</w:t>
-            </w:r>
-            <w:proofErr w:type="spellEnd"/>
-            <w:r>
-              <w:rPr>
-                <w:rFonts w:ascii="Arial" w:hAnsi="Arial" w:cs="Arial"/>
-                <w:b/>
-                <w:sz w:val="18"/>
-                <w:szCs w:val="18"/>
-              </w:rPr>
-              <w:t>»</w:t>
+              <w:t>«tomatowb»</w:t>
             </w:r>
             <w:r>
               <w:rPr>
@@ -9786,6 +9725,8 @@
             </w:r>
           </w:p>
         </w:tc>
+        <w:bookmarkStart w:id="1" w:name="_GoBack"/>
+        <w:bookmarkEnd w:id="1"/>
       </w:tr>
       <w:tr>
         <w:trPr>
@@ -9986,27 +9927,7 @@
                 <w:sz w:val="18"/>
                 <w:szCs w:val="18"/>
               </w:rPr>
-              <w:t>«</w:t>
-            </w:r>
-            <w:proofErr w:type="spellStart"/>
-            <w:r>
-              <w:rPr>
-                <w:rFonts w:ascii="Arial" w:hAnsi="Arial" w:cs="Arial"/>
-                <w:b/>
-                <w:sz w:val="18"/>
-                <w:szCs w:val="18"/>
-              </w:rPr>
-              <w:t>kohlrabiwn</w:t>
-            </w:r>
-            <w:proofErr w:type="spellEnd"/>
-            <w:r>
-              <w:rPr>
-                <w:rFonts w:ascii="Arial" w:hAnsi="Arial" w:cs="Arial"/>
-                <w:b/>
-                <w:sz w:val="18"/>
-                <w:szCs w:val="18"/>
-              </w:rPr>
-              <w:t>»</w:t>
+              <w:t>«kohlrabiwn»</w:t>
             </w:r>
             <w:r>
               <w:rPr>
@@ -10106,27 +10027,7 @@
                 <w:sz w:val="18"/>
                 <w:szCs w:val="18"/>
               </w:rPr>
-              <w:t>«</w:t>
-            </w:r>
-            <w:proofErr w:type="spellStart"/>
-            <w:r>
-              <w:rPr>
-                <w:rFonts w:ascii="Arial" w:hAnsi="Arial" w:cs="Arial"/>
-                <w:b/>
-                <w:sz w:val="18"/>
-                <w:szCs w:val="18"/>
-              </w:rPr>
-              <w:t>kohlrabivat</w:t>
-            </w:r>
-            <w:proofErr w:type="spellEnd"/>
-            <w:r>
-              <w:rPr>
-                <w:rFonts w:ascii="Arial" w:hAnsi="Arial" w:cs="Arial"/>
-                <w:b/>
-                <w:sz w:val="18"/>
-                <w:szCs w:val="18"/>
-              </w:rPr>
-              <w:t>»</w:t>
+              <w:t>«kohlrabivat»</w:t>
             </w:r>
             <w:r>
               <w:rPr>
@@ -10192,27 +10093,7 @@
                 <w:sz w:val="18"/>
                 <w:szCs w:val="18"/>
               </w:rPr>
-              <w:t>«</w:t>
-            </w:r>
-            <w:proofErr w:type="spellStart"/>
-            <w:r>
-              <w:rPr>
-                <w:rFonts w:ascii="Arial" w:hAnsi="Arial" w:cs="Arial"/>
-                <w:b/>
-                <w:sz w:val="18"/>
-                <w:szCs w:val="18"/>
-              </w:rPr>
-              <w:t>kohlrabiwb</w:t>
-            </w:r>
-            <w:proofErr w:type="spellEnd"/>
-            <w:r>
-              <w:rPr>
-                <w:rFonts w:ascii="Arial" w:hAnsi="Arial" w:cs="Arial"/>
-                <w:b/>
-                <w:sz w:val="18"/>
-                <w:szCs w:val="18"/>
-              </w:rPr>
-              <w:t>»</w:t>
+              <w:t>«kohlrabiwb»</w:t>
             </w:r>
             <w:r>
               <w:rPr>
@@ -19896,22 +19777,7 @@
           <w:lang w:val="pl-PL" w:eastAsia="pl-PL"/>
         </w:rPr>
         <w:br/>
-        <w:t xml:space="preserve">z pierwszym wnioskiem o pomoc. W przypadku zmiany okoliczności w zakresie dotyczącym uczestnictwa w grupie, o której mowa w art. 2 pkt 11 dyrektywy Parlament Europejskiego i Rady 2013/34/UE, dostawca jest zobowiązany złożyć kolejny załącznik XI wraz z wnioskiem o pomoc za okres, w </w:t>
-      </w:r>
-      <w:bookmarkStart w:id="1" w:name="_GoBack"/>
-      <w:bookmarkEnd w:id="1"/>
-      <w:r>
-        <w:rPr>
-          <w:rFonts w:ascii="Arial" w:eastAsia="Times New Roman" w:hAnsi="Arial" w:cs="Arial"/>
-          <w:bCs/>
-          <w:i/>
-          <w:iCs/>
-          <w:color w:val="339966"/>
-          <w:sz w:val="16"/>
-          <w:szCs w:val="16"/>
-          <w:lang w:val="pl-PL" w:eastAsia="pl-PL"/>
-        </w:rPr>
-        <w:t>którym nastąpiła przedmiotowa zmiana okoliczności.</w:t>
+        <w:t>z pierwszym wnioskiem o pomoc. W przypadku zmiany okoliczności w zakresie dotyczącym uczestnictwa w grupie, o której mowa w art. 2 pkt 11 dyrektywy Parlament Europejskiego i Rady 2013/34/UE, dostawca jest zobowiązany złożyć kolejny załącznik XI wraz z wnioskiem o pomoc za okres, w którym nastąpiła przedmiotowa zmiana okoliczności.</w:t>
       </w:r>
     </w:p>
     <w:p>
@@ -20556,7 +20422,7 @@
             </wp:inline>
           </w:drawing>
         </mc:Choice>
-        <mc:Fallback xmlns:w16sdtfl="http://schemas.microsoft.com/office/word/2024/wordml/sdtformatlock" xmlns:w16sdtdh="http://schemas.microsoft.com/office/word/2020/wordml/sdtdatahash" xmlns:w16du="http://schemas.microsoft.com/office/word/2023/wordml/word16du" xmlns:w16="http://schemas.microsoft.com/office/word/2018/wordml" xmlns:w16cid="http://schemas.microsoft.com/office/word/2016/wordml/cid" xmlns:w16cex="http://schemas.microsoft.com/office/word/2018/wordml/cex" xmlns:oel="http://schemas.microsoft.com/office/2019/extlst" xmlns:am3d="http://schemas.microsoft.com/office/drawing/2017/model3d" xmlns:aink="http://schemas.microsoft.com/office/drawing/2016/ink" xmlns:cx8="http://schemas.microsoft.com/office/drawing/2016/5/14/chartex" xmlns:cx7="http://schemas.microsoft.com/office/drawing/2016/5/13/chartex" xmlns:cx6="http://schemas.microsoft.com/office/drawing/2016/5/12/chartex" xmlns:cx5="http://schemas.microsoft.com/office/drawing/2016/5/11/chartex" xmlns:cx4="http://schemas.microsoft.com/office/drawing/2016/5/10/chartex" xmlns:cx3="http://schemas.microsoft.com/office/drawing/2016/5/9/chartex" xmlns:cx2="http://schemas.microsoft.com/office/drawing/2015/10/21/chartex">
+        <mc:Fallback xmlns:cx2="http://schemas.microsoft.com/office/drawing/2015/10/21/chartex" xmlns:cx3="http://schemas.microsoft.com/office/drawing/2016/5/9/chartex" xmlns:cx4="http://schemas.microsoft.com/office/drawing/2016/5/10/chartex" xmlns:cx5="http://schemas.microsoft.com/office/drawing/2016/5/11/chartex" xmlns:cx6="http://schemas.microsoft.com/office/drawing/2016/5/12/chartex" xmlns:cx7="http://schemas.microsoft.com/office/drawing/2016/5/13/chartex" xmlns:cx8="http://schemas.microsoft.com/office/drawing/2016/5/14/chartex" xmlns:aink="http://schemas.microsoft.com/office/drawing/2016/ink" xmlns:am3d="http://schemas.microsoft.com/office/drawing/2017/model3d" xmlns:oel="http://schemas.microsoft.com/office/2019/extlst" xmlns:w16cex="http://schemas.microsoft.com/office/word/2018/wordml/cex" xmlns:w16cid="http://schemas.microsoft.com/office/word/2016/wordml/cid" xmlns:w16="http://schemas.microsoft.com/office/word/2018/wordml" xmlns:w16du="http://schemas.microsoft.com/office/word/2023/wordml/word16du" xmlns:w16sdtdh="http://schemas.microsoft.com/office/word/2020/wordml/sdtdatahash" xmlns:w16sdtfl="http://schemas.microsoft.com/office/word/2024/wordml/sdtformatlock">
           <w:pict>
             <v:group w14:anchorId="6521396B" id="Kanwa 1" o:spid="_x0000_s1026" editas="canvas" style="width:549pt;height:9pt;mso-position-horizontal-relative:char;mso-position-vertical-relative:line" coordsize="69723,1143" o:gfxdata="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">
               <v:shapetype id="_x0000_t75" coordsize="21600,21600" o:spt="75" o:preferrelative="t" path="m@4@5l@4@11@9@11@9@5xe" filled="f" stroked="f">
@@ -21453,7 +21319,7 @@
               <v:shape id="_x0000_i1025" type="#_x0000_t75" style="width:57.75pt;height:50.25pt" fillcolor="window">
                 <v:imagedata r:id="rId1" o:title=""/>
               </v:shape>
-              <o:OLEObject Type="Embed" ProgID="PBrush" ShapeID="_x0000_i1025" DrawAspect="Content" ObjectID="_1852718480" r:id="rId2"/>
+              <o:OLEObject Type="Embed" ProgID="PBrush" ShapeID="_x0000_i1025" DrawAspect="Content" ObjectID="_1854030481" r:id="rId2"/>
             </w:object>
           </w:r>
         </w:p>
@@ -21594,7 +21460,7 @@
             </wp:inline>
           </w:drawing>
         </mc:Choice>
-        <mc:Fallback xmlns:w16sdtfl="http://schemas.microsoft.com/office/word/2024/wordml/sdtformatlock" xmlns:w16sdtdh="http://schemas.microsoft.com/office/word/2020/wordml/sdtdatahash" xmlns:w16du="http://schemas.microsoft.com/office/word/2023/wordml/word16du" xmlns:w16="http://schemas.microsoft.com/office/word/2018/wordml" xmlns:w16cid="http://schemas.microsoft.com/office/word/2016/wordml/cid" xmlns:w16cex="http://schemas.microsoft.com/office/word/2018/wordml/cex" xmlns:oel="http://schemas.microsoft.com/office/2019/extlst" xmlns:am3d="http://schemas.microsoft.com/office/drawing/2017/model3d" xmlns:aink="http://schemas.microsoft.com/office/drawing/2016/ink" xmlns:cx8="http://schemas.microsoft.com/office/drawing/2016/5/14/chartex" xmlns:cx7="http://schemas.microsoft.com/office/drawing/2016/5/13/chartex" xmlns:cx6="http://schemas.microsoft.com/office/drawing/2016/5/12/chartex" xmlns:cx5="http://schemas.microsoft.com/office/drawing/2016/5/11/chartex" xmlns:cx4="http://schemas.microsoft.com/office/drawing/2016/5/10/chartex" xmlns:cx3="http://schemas.microsoft.com/office/drawing/2016/5/9/chartex" xmlns:cx2="http://schemas.microsoft.com/office/drawing/2015/10/21/chartex">
+        <mc:Fallback xmlns:cx2="http://schemas.microsoft.com/office/drawing/2015/10/21/chartex" xmlns:cx3="http://schemas.microsoft.com/office/drawing/2016/5/9/chartex" xmlns:cx4="http://schemas.microsoft.com/office/drawing/2016/5/10/chartex" xmlns:cx5="http://schemas.microsoft.com/office/drawing/2016/5/11/chartex" xmlns:cx6="http://schemas.microsoft.com/office/drawing/2016/5/12/chartex" xmlns:cx7="http://schemas.microsoft.com/office/drawing/2016/5/13/chartex" xmlns:cx8="http://schemas.microsoft.com/office/drawing/2016/5/14/chartex" xmlns:aink="http://schemas.microsoft.com/office/drawing/2016/ink" xmlns:am3d="http://schemas.microsoft.com/office/drawing/2017/model3d" xmlns:oel="http://schemas.microsoft.com/office/2019/extlst" xmlns:w16cex="http://schemas.microsoft.com/office/word/2018/wordml/cex" xmlns:w16cid="http://schemas.microsoft.com/office/word/2016/wordml/cid" xmlns:w16="http://schemas.microsoft.com/office/word/2018/wordml" xmlns:w16du="http://schemas.microsoft.com/office/word/2023/wordml/word16du" xmlns:w16sdtdh="http://schemas.microsoft.com/office/word/2020/wordml/sdtdatahash" xmlns:w16sdtfl="http://schemas.microsoft.com/office/word/2024/wordml/sdtformatlock">
           <w:pict>
             <v:group w14:anchorId="26DD9A25" id="Kanwa 2" o:spid="_x0000_s1026" editas="canvas" style="width:549pt;height:9pt;mso-position-horizontal-relative:char;mso-position-vertical-relative:line" coordsize="69723,1143" o:gfxdata="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">
               <v:shape id="_x0000_s1027" type="#_x0000_t75" style="position:absolute;width:69723;height:1143;visibility:visible;mso-wrap-style:square">

</xml_diff>